<commit_message>
Align HTML/DOCX font fallback with L8
Remove extra fallbacks (Helvetica Neue, Arial, Consolas) from the
HTML template and switch the DOCX reference from Consolas to Cascadia
Code, matching the locked L8 chain. Regenerate guide-reference.docx.
</commit_message>
<xml_diff>
--- a/templates/guide/guide-reference.docx
+++ b/templates/guide/guide-reference.docx
@@ -1074,7 +1074,7 @@
       <w:shd w:fill="F6F8FA" w:val="clear"/>
     </w:pPr>
     <w:rPr>
-      <w:rFonts w:ascii="Consolas" w:hAnsi="Consolas"/>
+      <w:rFonts w:ascii="Cascadia Code" w:hAnsi="Cascadia Code"/>
       <w:color w:val="1F2328"/>
       <w:sz w:val="20"/>
     </w:rPr>
@@ -1082,7 +1082,7 @@
   <w:style w:type="character" w:customStyle="1" w:styleId="badge">
     <w:name w:val="badge"/>
     <w:rPr>
-      <w:rFonts w:ascii="Consolas" w:hAnsi="Consolas"/>
+      <w:rFonts w:ascii="Cascadia Code" w:hAnsi="Cascadia Code"/>
       <w:b/>
       <w:color w:val="FFFFFF"/>
       <w:sz w:val="18"/>

</xml_diff>

<commit_message>
v2.3.0: font configuration across all output formats
DOCX: set theme majorFont/minorFont to HarmonyOS Sans via theme1.xml
mutation (python-docx has no theme API). Fixes Cambria/Calibri default.
EPUB: new guide-epub.css brand stylesheet via --css, matching HTML
template fonts/colors/callouts/tables.
LaTeX: rename internal \consolasfont -> \lg@codefont (was misleading).
README: add guide-epub.css to layout, note EPUB brand CSS.
</commit_message>
<xml_diff>
--- a/templates/guide/guide-reference.docx
+++ b/templates/guide/guide-reference.docx
@@ -545,7 +545,7 @@
   <w:docDefaults>
     <w:rPrDefault>
       <w:rPr>
-        <w:rFonts w:asciiTheme="minorHAnsi" w:eastAsiaTheme="minorHAnsi" w:hAnsiTheme="minorHAnsi" w:cstheme="minorBidi"/>
+        <w:rFonts w:asciiTheme="minorHAnsi" w:eastAsiaTheme="minorHAnsi" w:hAnsiTheme="minorHAnsi" w:cstheme="minorBidi" w:ascii="HarmonyOS Sans" w:hAnsi="HarmonyOS Sans" w:eastAsia="HarmonyOS Sans" w:cs="HarmonyOS Sans"/>
         <w:sz w:val="24"/>
         <w:szCs w:val="24"/>
         <w:lang w:val="en-US" w:eastAsia="en-US" w:bidi="ar-SA"/>
@@ -1144,9 +1144,9 @@
     </a:clrScheme>
     <a:fontScheme name="Office">
       <a:majorFont>
-        <a:latin typeface="Calibri"/>
-        <a:ea typeface=""/>
-        <a:cs typeface=""/>
+        <a:latin typeface="HarmonyOS Sans"/>
+        <a:ea typeface="HarmonyOS Sans"/>
+        <a:cs typeface="HarmonyOS Sans"/>
         <a:font script="Jpan" typeface="ＭＳ ゴシック"/>
         <a:font script="Hang" typeface="맑은 고딕"/>
         <a:font script="Hans" typeface="宋体"/>
@@ -1178,9 +1178,9 @@
         <a:font script="Uigh" typeface="Microsoft Uighur"/>
       </a:majorFont>
       <a:minorFont>
-        <a:latin typeface="Cambria"/>
-        <a:ea typeface=""/>
-        <a:cs typeface=""/>
+        <a:latin typeface="HarmonyOS Sans"/>
+        <a:ea typeface="HarmonyOS Sans"/>
+        <a:cs typeface="HarmonyOS Sans"/>
         <a:font script="Jpan" typeface="ＭＳ 明朝"/>
         <a:font script="Hang" typeface="맑은 고딕"/>
         <a:font script="Hans" typeface="宋体"/>

</xml_diff>

<commit_message>
v2.5.0: multi-format styling fixes + L18 (PDF is the reference)
L18: PDF is the primary output and visual reference. DOCX, MD, HTML
must match the PDF as closely as possible.

Image references: pandoc now runs from project dir (not src/) so
assets/ is found. Images properly embedded in DOCX.

DOCX callouts: style names renamed to match Lua filter classes
(warning/tip/infobox). Lua filter uses custom-style attribute.
Callouts now have colored backgrounds and borders.

DOCX headings: post-processing (fix_generated_docx) directly modifies
styles.xml to set near-black color and H1 red bottom border, bypassing
python-docx which doesn't remove themeColor.

HTML: H1 color changed to near-black (matches PDF). Callout label
colors added (warning=red, tip=green, infobox=blue).
</commit_message>
<xml_diff>
--- a/templates/guide/guide-reference.docx
+++ b/templates/guide/guide-reference.docx
@@ -1029,8 +1029,8 @@
       <w:color w:val="365F91" w:themeColor="accent1" w:themeShade="BF"/>
     </w:rPr>
   </w:style>
-  <w:style w:type="paragraph" w:customStyle="1" w:styleId="Warning">
-    <w:name w:val="Warning"/>
+  <w:style w:type="paragraph" w:customStyle="1" w:styleId="warning">
+    <w:name w:val="warning"/>
     <w:pPr>
       <w:pBdr>
         <w:left w:val="single" w:sz="24" w:space="4" w:color="F57C00"/>
@@ -1039,8 +1039,8 @@
       <w:ind w:left="283"/>
     </w:pPr>
   </w:style>
-  <w:style w:type="paragraph" w:customStyle="1" w:styleId="Tip">
-    <w:name w:val="Tip"/>
+  <w:style w:type="paragraph" w:customStyle="1" w:styleId="tip">
+    <w:name w:val="tip"/>
     <w:pPr>
       <w:pBdr>
         <w:left w:val="single" w:sz="24" w:space="4" w:color="2E7D32"/>
@@ -1049,8 +1049,8 @@
       <w:ind w:left="283"/>
     </w:pPr>
   </w:style>
-  <w:style w:type="paragraph" w:customStyle="1" w:styleId="Info">
-    <w:name w:val="Info"/>
+  <w:style w:type="paragraph" w:customStyle="1" w:styleId="infobox">
+    <w:name w:val="infobox"/>
     <w:pPr>
       <w:pBdr>
         <w:left w:val="single" w:sz="24" w:space="4" w:color="1565C0"/>
@@ -1091,11 +1091,43 @@
   </w:style>
   <w:style w:type="paragraph" w:customStyle="1" w:styleId="Heading1">
     <w:name w:val="heading 1"/>
+    <w:pPr>
+      <w:pBdr>
+        <w:bottom w:val="single" w:sz="12" w:space="1" w:color="C7000B"/>
+      </w:pBdr>
+    </w:pPr>
     <w:rPr>
       <w:rFonts w:ascii="HarmonyOS Sans" w:hAnsi="HarmonyOS Sans"/>
       <w:b/>
-      <w:color w:val="C7000B"/>
+      <w:color w:val="1F2328"/>
       <w:sz w:val="40"/>
+    </w:rPr>
+  </w:style>
+  <w:style w:type="paragraph" w:customStyle="1" w:styleId="Heading2">
+    <w:name w:val="heading 2"/>
+    <w:rPr>
+      <w:rFonts w:ascii="HarmonyOS Sans" w:hAnsi="HarmonyOS Sans"/>
+      <w:b/>
+      <w:color w:val="1F2328"/>
+      <w:sz w:val="36"/>
+    </w:rPr>
+  </w:style>
+  <w:style w:type="paragraph" w:customStyle="1" w:styleId="Heading3">
+    <w:name w:val="heading 3"/>
+    <w:rPr>
+      <w:rFonts w:ascii="HarmonyOS Sans" w:hAnsi="HarmonyOS Sans"/>
+      <w:b/>
+      <w:color w:val="1F2328"/>
+      <w:sz w:val="32"/>
+    </w:rPr>
+  </w:style>
+  <w:style w:type="paragraph" w:customStyle="1" w:styleId="Heading4">
+    <w:name w:val="heading 4"/>
+    <w:rPr>
+      <w:rFonts w:ascii="HarmonyOS Sans" w:hAnsi="HarmonyOS Sans"/>
+      <w:b/>
+      <w:color w:val="1F2328"/>
+      <w:sz w:val="28"/>
     </w:rPr>
   </w:style>
 </w:styles>

</xml_diff>

<commit_message>
v2.5.1: review fixes — H2-H4 weight, build robustness, CSS variables
H2-H4 font weight: PDF uses \normalfont (regular). Fixed DOCX bold=False
and HTML font-weight=400 to match. L18 compliance.

build.sh: DOCX post-processing made non-fatal (was silently killing
builds on failure due to 2>/dev/null + set -e).

fix_generated_docx: create pPr if missing (was silently skipping H1
border). Strip <w:b/>/<w:bCs/> from H2-H4 in generated DOCX. Fix
--fix argument parsing for direct invocation.

HTML callout labels: use CSS variables instead of hardcoded hex.
</commit_message>
<xml_diff>
--- a/templates/guide/guide-reference.docx
+++ b/templates/guide/guide-reference.docx
@@ -1032,31 +1032,31 @@
   <w:style w:type="paragraph" w:customStyle="1" w:styleId="warning">
     <w:name w:val="warning"/>
     <w:pPr>
+      <w:ind w:left="283"/>
       <w:pBdr>
         <w:left w:val="single" w:sz="24" w:space="4" w:color="F57C00"/>
       </w:pBdr>
       <w:shd w:fill="FFF8E1" w:val="clear"/>
-      <w:ind w:left="283"/>
     </w:pPr>
   </w:style>
   <w:style w:type="paragraph" w:customStyle="1" w:styleId="tip">
     <w:name w:val="tip"/>
     <w:pPr>
+      <w:ind w:left="283"/>
       <w:pBdr>
         <w:left w:val="single" w:sz="24" w:space="4" w:color="2E7D32"/>
       </w:pBdr>
       <w:shd w:fill="E8F5E9" w:val="clear"/>
-      <w:ind w:left="283"/>
     </w:pPr>
   </w:style>
   <w:style w:type="paragraph" w:customStyle="1" w:styleId="infobox">
     <w:name w:val="infobox"/>
     <w:pPr>
+      <w:ind w:left="283"/>
       <w:pBdr>
         <w:left w:val="single" w:sz="24" w:space="4" w:color="1565C0"/>
       </w:pBdr>
       <w:shd w:fill="E3F2FD" w:val="clear"/>
-      <w:ind w:left="283"/>
     </w:pPr>
   </w:style>
   <w:style w:type="paragraph" w:customStyle="1" w:styleId="objectives">

</xml_diff>

<commit_message>
v2.5.2: DOCX cover page + font fixes
Title style: was 18pt blue (pandoc default), now 36pt near-black bold
centered matching PDF cover.

Cover page content: DOCX now includes cover text (16pt centered) and
version/date (12pt centered) after title, plus page break — matching
PDF \makecover layout.

VerbatimChar font: was Consolas, now Cascadia Code matching PDF.

Theme-only font refs: all styles now have explicit ascii/hAnsi font
names alongside theme refs. Prevents Word fallback to Cambria when
HarmonyOS Sans is not installed.
</commit_message>
<xml_diff>
--- a/templates/guide/guide-reference.docx
+++ b/templates/guide/guide-reference.docx
@@ -597,11 +597,11 @@
       <w:jc w:val="center"/>
     </w:pPr>
     <w:rPr>
-      <w:rFonts w:asciiTheme="majorHAnsi" w:eastAsiaTheme="majorEastAsia" w:hAnsiTheme="majorHAnsi" w:cstheme="majorBidi"/>
+      <w:rFonts w:asciiTheme="majorHAnsi" w:eastAsiaTheme="majorEastAsia" w:hAnsiTheme="majorHAnsi" w:cstheme="majorBidi" w:ascii="HarmonyOS Sans" w:hAnsi="HarmonyOS Sans"/>
       <w:b/>
       <w:bCs/>
-      <w:color w:val="345A8A" w:themeColor="accent1" w:themeShade="B5"/>
-      <w:sz w:val="36"/>
+      <w:color w:val="1F2328"/>
+      <w:sz w:val="72"/>
       <w:szCs w:val="36"/>
     </w:rPr>
   </w:style>
@@ -986,7 +986,8 @@
     <w:name w:val="Verbatim Char"/>
     <w:basedOn w:val="BodyTextChar"/>
     <w:rPr>
-      <w:rFonts w:ascii="Consolas" w:hAnsi="Consolas"/>
+      <w:rFonts w:ascii="Cascadia Code" w:hAnsi="Cascadia Code"/>
+      <w:color w:val="1F2328"/>
       <w:sz w:val="22"/>
     </w:rPr>
   </w:style>

</xml_diff>

<commit_message>
v2.5.3: DOCX styling overhaul — match PDF (Tier 1)
Heading sizes: restore PDF values (H1=20pt, H2=18pt, H3=16pt, H4=14pt)
that pandoc was overriding with its defaults.

Body text: 12pt → 10.5pt matching PDF. Paragraph spacing 10pt → 4pt.

hutable: render as OpenXML table with Huawei-red header row (#C7000B bg,
white bold text), alternating body rows (white/#F6F8FA), red cell borders,
9pt centered font — matching PDF hutable environment.

Callout boxes: switch from custom-style Divs to single-cell OpenXML tables
with cell shading, thick colored left border, and colored bold label.
Label colors: warning=#C7000B, tip=#2E7D32, infobox=#1565C0.

Page layout: A4 with 3/3/2/2 cm margins (was 1in all sides).
Headers: document title via STYLEREF field (10pt, centered).
Footers: page number via PAGE field (10pt, centered).
Different first page: no header/footer on cover.
</commit_message>
<xml_diff>
--- a/templates/guide/guide-reference.docx
+++ b/templates/guide/guide-reference.docx
@@ -382,7 +382,13 @@
 </w:t>
       </w:r>
     </w:p>
-    <w:sectPr/>
+    <w:sectPr>
+      <w:headerReference w:type="default" r:id="rId9"/>
+      <w:footerReference w:type="default" r:id="rId10"/>
+      <w:pgSz w:w="11906" w:h="16838"/>
+      <w:pgMar w:top="1701" w:bottom="1701" w:left="1134" w:right="1134"/>
+      <w:titlePg/>
+    </w:sectPr>
   </w:body>
 </w:document>
 </file>
@@ -391,6 +397,59 @@
 <w:comments xmlns:w="http://schemas.openxmlformats.org/wordprocessingml/2006/main" xmlns:m="http://schemas.openxmlformats.org/officeDocument/2006/math" xmlns:r="http://schemas.openxmlformats.org/officeDocument/2006/relationships" xmlns:o="urn:schemas-microsoft-com:office:office" xmlns:v="urn:schemas-microsoft-com:vml" xmlns:w10="urn:schemas-microsoft-com:office:word" xmlns:a="http://schemas.openxmlformats.org/drawingml/2006/main" xmlns:pic="http://schemas.openxmlformats.org/drawingml/2006/picture" xmlns:wp="http://schemas.openxmlformats.org/drawingml/2006/wordprocessingDrawing"/>
 </file>
 
+<file path=word/footer1.xml><?xml version="1.0" encoding="utf-8"?>
+<w:ftr xmlns:m="http://schemas.openxmlformats.org/officeDocument/2006/math" xmlns:mc="http://schemas.openxmlformats.org/markup-compatibility/2006" xmlns:mo="http://schemas.microsoft.com/office/mac/office/2008/main" xmlns:mv="urn:schemas-microsoft-com:mac:vml" xmlns:o="urn:schemas-microsoft-com:office:office" xmlns:r="http://schemas.openxmlformats.org/officeDocument/2006/relationships" xmlns:v="urn:schemas-microsoft-com:vml" xmlns:w10="urn:schemas-microsoft-com:office:word" xmlns:w14="http://schemas.microsoft.com/office/word/2010/wordml" xmlns:w="http://schemas.openxmlformats.org/wordprocessingml/2006/main" xmlns:wne="http://schemas.microsoft.com/office/word/2006/wordml" xmlns:wp14="http://schemas.microsoft.com/office/word/2010/wordprocessingDrawing" xmlns:wp="http://schemas.openxmlformats.org/drawingml/2006/wordprocessingDrawing" xmlns:wpc="http://schemas.microsoft.com/office/word/2010/wordprocessingCanvas" xmlns:wpg="http://schemas.microsoft.com/office/word/2010/wordprocessingGroup" xmlns:wpi="http://schemas.microsoft.com/office/word/2010/wordprocessingInk" xmlns:wps="http://schemas.microsoft.com/office/word/2010/wordprocessingShape" mc:Ignorable="w14 wp14">
+  <w:p>
+    <w:pPr>
+      <w:pStyle w:val="Footer"/>
+      <w:jc w:val="center"/>
+    </w:pPr>
+    <w:r>
+      <w:rPr>
+        <w:rFonts w:ascii="HarmonyOS Sans" w:hAnsi="HarmonyOS Sans"/>
+        <w:sz w:val="20"/>
+      </w:rPr>
+      <w:fldChar w:fldCharType="begin"/>
+      <w:fldChar w:fldCharType="begin"/>
+    </w:r>
+    <w:r>
+      <w:rPr>
+        <w:rFonts w:ascii="HarmonyOS Sans" w:hAnsi="HarmonyOS Sans"/>
+        <w:sz w:val="20"/>
+      </w:rPr>
+      <w:instrText xml:space="preserve"> PAGE </w:instrText>
+      <w:instrText xml:space="preserve"> PAGE </w:instrText>
+    </w:r>
+    <w:r>
+      <w:rPr>
+        <w:rFonts w:ascii="HarmonyOS Sans" w:hAnsi="HarmonyOS Sans"/>
+        <w:sz w:val="20"/>
+      </w:rPr>
+      <w:fldChar w:fldCharType="end"/>
+      <w:fldChar w:fldCharType="end"/>
+    </w:r>
+    <w:r>
+      <w:rPr>
+        <w:rFonts w:ascii="HarmonyOS Sans" w:hAnsi="HarmonyOS Sans"/>
+        <w:sz w:val="20"/>
+      </w:rPr>
+    </w:r>
+    <w:r>
+      <w:rPr>
+        <w:rFonts w:ascii="HarmonyOS Sans" w:hAnsi="HarmonyOS Sans"/>
+        <w:sz w:val="20"/>
+      </w:rPr>
+    </w:r>
+    <w:r>
+      <w:rPr>
+        <w:rFonts w:ascii="HarmonyOS Sans" w:hAnsi="HarmonyOS Sans"/>
+        <w:sz w:val="20"/>
+      </w:rPr>
+    </w:r>
+  </w:p>
+</w:ftr>
+</file>
+
 <file path=word/footnotes.xml><?xml version="1.0" encoding="utf-8"?>
 <w:footnotes xmlns:w="http://schemas.openxmlformats.org/wordprocessingml/2006/main" xmlns:m="http://schemas.openxmlformats.org/officeDocument/2006/math" xmlns:r="http://schemas.openxmlformats.org/officeDocument/2006/relationships" xmlns:o="urn:schemas-microsoft-com:office:office" xmlns:v="urn:schemas-microsoft-com:vml" xmlns:w10="urn:schemas-microsoft-com:office:word" xmlns:a="http://schemas.openxmlformats.org/drawingml/2006/main" xmlns:pic="http://schemas.openxmlformats.org/drawingml/2006/picture" xmlns:wp="http://schemas.openxmlformats.org/drawingml/2006/wordprocessingDrawing">
   <w:footnote w:type="continuationSeparator" w:id="0">
@@ -427,6 +486,87 @@
     </w:p>
   </w:footnote>
 </w:footnotes>
+</file>
+
+<file path=word/header1.xml><?xml version="1.0" encoding="utf-8"?>
+<w:hdr xmlns:m="http://schemas.openxmlformats.org/officeDocument/2006/math" xmlns:mc="http://schemas.openxmlformats.org/markup-compatibility/2006" xmlns:mo="http://schemas.microsoft.com/office/mac/office/2008/main" xmlns:mv="urn:schemas-microsoft-com:mac:vml" xmlns:o="urn:schemas-microsoft-com:office:office" xmlns:r="http://schemas.openxmlformats.org/officeDocument/2006/relationships" xmlns:v="urn:schemas-microsoft-com:vml" xmlns:w10="urn:schemas-microsoft-com:office:word" xmlns:w14="http://schemas.microsoft.com/office/word/2010/wordml" xmlns:w="http://schemas.openxmlformats.org/wordprocessingml/2006/main" xmlns:wne="http://schemas.microsoft.com/office/word/2006/wordml" xmlns:wp14="http://schemas.microsoft.com/office/word/2010/wordprocessingDrawing" xmlns:wp="http://schemas.openxmlformats.org/drawingml/2006/wordprocessingDrawing" xmlns:wpc="http://schemas.microsoft.com/office/word/2010/wordprocessingCanvas" xmlns:wpg="http://schemas.microsoft.com/office/word/2010/wordprocessingGroup" xmlns:wpi="http://schemas.microsoft.com/office/word/2010/wordprocessingInk" xmlns:wps="http://schemas.microsoft.com/office/word/2010/wordprocessingShape" mc:Ignorable="w14 wp14">
+  <w:p>
+    <w:pPr>
+      <w:pStyle w:val="Header"/>
+      <w:jc w:val="center"/>
+    </w:pPr>
+    <w:r>
+      <w:rPr>
+        <w:rFonts w:ascii="HarmonyOS Sans" w:hAnsi="HarmonyOS Sans"/>
+        <w:sz w:val="20"/>
+      </w:rPr>
+      <w:fldChar w:fldCharType="begin"/>
+      <w:fldChar w:fldCharType="begin"/>
+    </w:r>
+    <w:r>
+      <w:rPr>
+        <w:rFonts w:ascii="HarmonyOS Sans" w:hAnsi="HarmonyOS Sans"/>
+        <w:sz w:val="20"/>
+      </w:rPr>
+      <w:instrText xml:space="preserve"> STYLEREF "Title" \* MERGEFORMAT </w:instrText>
+      <w:instrText xml:space="preserve"> STYLEREF "Title" \* MERGEFORMAT </w:instrText>
+    </w:r>
+    <w:r>
+      <w:rPr>
+        <w:rFonts w:ascii="HarmonyOS Sans" w:hAnsi="HarmonyOS Sans"/>
+        <w:sz w:val="20"/>
+      </w:rPr>
+      <w:fldChar w:fldCharType="separate"/>
+      <w:fldChar w:fldCharType="separate"/>
+    </w:r>
+    <w:r>
+      <w:rPr>
+        <w:rFonts w:ascii="HarmonyOS Sans" w:hAnsi="HarmonyOS Sans"/>
+        <w:sz w:val="20"/>
+      </w:rPr>
+      <w:t>Document Title</w:t>
+    </w:r>
+    <w:r>
+      <w:rPr>
+        <w:rFonts w:ascii="HarmonyOS Sans" w:hAnsi="HarmonyOS Sans"/>
+        <w:sz w:val="20"/>
+      </w:rPr>
+      <w:fldChar w:fldCharType="end"/>
+      <w:fldChar w:fldCharType="end"/>
+    </w:r>
+    <w:r>
+      <w:rPr>
+        <w:rFonts w:ascii="HarmonyOS Sans" w:hAnsi="HarmonyOS Sans"/>
+        <w:sz w:val="20"/>
+      </w:rPr>
+    </w:r>
+    <w:r>
+      <w:rPr>
+        <w:rFonts w:ascii="HarmonyOS Sans" w:hAnsi="HarmonyOS Sans"/>
+        <w:sz w:val="20"/>
+      </w:rPr>
+    </w:r>
+    <w:r>
+      <w:rPr>
+        <w:rFonts w:ascii="HarmonyOS Sans" w:hAnsi="HarmonyOS Sans"/>
+        <w:sz w:val="20"/>
+      </w:rPr>
+    </w:r>
+    <w:r>
+      <w:rPr>
+        <w:rFonts w:ascii="HarmonyOS Sans" w:hAnsi="HarmonyOS Sans"/>
+        <w:sz w:val="20"/>
+      </w:rPr>
+      <w:t>Document Title</w:t>
+    </w:r>
+    <w:r>
+      <w:rPr>
+        <w:rFonts w:ascii="HarmonyOS Sans" w:hAnsi="HarmonyOS Sans"/>
+        <w:sz w:val="20"/>
+      </w:rPr>
+    </w:r>
+  </w:p>
+</w:hdr>
 </file>
 
 <file path=word/numbering.xml><?xml version="1.0" encoding="utf-8"?>

</xml_diff>

<commit_message>
v2.5.5: DOCX final polish — bug fixes from end-to-end review
Language detection: moved to module level so RawBlock/RawInline handlers
have correct language. PT labels now render correctly in all formats.

H4 italic: pandoc default includes <w:i/>, now stripped.
Badge font: Cascadia Code -> HarmonyOS Sans (matches PDF).
Syntax highlighting: stripped for DOCX (PDF uses monochrome).
BodyText spacing: after=180 -> after=80 (matches PDF parskip=4pt).
Header/footer: main() now idempotent (clears existing runs).
VerbatimChar: 11pt -> 10pt. Cover: added time. Code: added margins.
</commit_message>
<xml_diff>
--- a/templates/guide/guide-reference.docx
+++ b/templates/guide/guide-reference.docx
@@ -410,14 +410,12 @@
         <w:sz w:val="20"/>
       </w:rPr>
       <w:fldChar w:fldCharType="begin"/>
-      <w:fldChar w:fldCharType="begin"/>
     </w:r>
     <w:r>
       <w:rPr>
         <w:rFonts w:ascii="HarmonyOS Sans" w:hAnsi="HarmonyOS Sans"/>
         <w:sz w:val="20"/>
       </w:rPr>
-      <w:instrText xml:space="preserve"> PAGE </w:instrText>
       <w:instrText xml:space="preserve"> PAGE </w:instrText>
     </w:r>
     <w:r>
@@ -426,25 +424,6 @@
         <w:sz w:val="20"/>
       </w:rPr>
       <w:fldChar w:fldCharType="end"/>
-      <w:fldChar w:fldCharType="end"/>
-    </w:r>
-    <w:r>
-      <w:rPr>
-        <w:rFonts w:ascii="HarmonyOS Sans" w:hAnsi="HarmonyOS Sans"/>
-        <w:sz w:val="20"/>
-      </w:rPr>
-    </w:r>
-    <w:r>
-      <w:rPr>
-        <w:rFonts w:ascii="HarmonyOS Sans" w:hAnsi="HarmonyOS Sans"/>
-        <w:sz w:val="20"/>
-      </w:rPr>
-    </w:r>
-    <w:r>
-      <w:rPr>
-        <w:rFonts w:ascii="HarmonyOS Sans" w:hAnsi="HarmonyOS Sans"/>
-        <w:sz w:val="20"/>
-      </w:rPr>
     </w:r>
   </w:p>
 </w:ftr>
@@ -501,7 +480,6 @@
         <w:sz w:val="20"/>
       </w:rPr>
       <w:fldChar w:fldCharType="begin"/>
-      <w:fldChar w:fldCharType="begin"/>
     </w:r>
     <w:r>
       <w:rPr>
@@ -509,14 +487,12 @@
         <w:sz w:val="20"/>
       </w:rPr>
       <w:instrText xml:space="preserve"> STYLEREF "Title" \* MERGEFORMAT </w:instrText>
-      <w:instrText xml:space="preserve"> STYLEREF "Title" \* MERGEFORMAT </w:instrText>
     </w:r>
     <w:r>
       <w:rPr>
         <w:rFonts w:ascii="HarmonyOS Sans" w:hAnsi="HarmonyOS Sans"/>
         <w:sz w:val="20"/>
       </w:rPr>
-      <w:fldChar w:fldCharType="separate"/>
       <w:fldChar w:fldCharType="separate"/>
     </w:r>
     <w:r>
@@ -532,38 +508,6 @@
         <w:sz w:val="20"/>
       </w:rPr>
       <w:fldChar w:fldCharType="end"/>
-      <w:fldChar w:fldCharType="end"/>
-    </w:r>
-    <w:r>
-      <w:rPr>
-        <w:rFonts w:ascii="HarmonyOS Sans" w:hAnsi="HarmonyOS Sans"/>
-        <w:sz w:val="20"/>
-      </w:rPr>
-    </w:r>
-    <w:r>
-      <w:rPr>
-        <w:rFonts w:ascii="HarmonyOS Sans" w:hAnsi="HarmonyOS Sans"/>
-        <w:sz w:val="20"/>
-      </w:rPr>
-    </w:r>
-    <w:r>
-      <w:rPr>
-        <w:rFonts w:ascii="HarmonyOS Sans" w:hAnsi="HarmonyOS Sans"/>
-        <w:sz w:val="20"/>
-      </w:rPr>
-    </w:r>
-    <w:r>
-      <w:rPr>
-        <w:rFonts w:ascii="HarmonyOS Sans" w:hAnsi="HarmonyOS Sans"/>
-        <w:sz w:val="20"/>
-      </w:rPr>
-      <w:t>Document Title</w:t>
-    </w:r>
-    <w:r>
-      <w:rPr>
-        <w:rFonts w:ascii="HarmonyOS Sans" w:hAnsi="HarmonyOS Sans"/>
-        <w:sz w:val="20"/>
-      </w:rPr>
     </w:r>
   </w:p>
 </w:hdr>
@@ -1223,7 +1167,7 @@
   <w:style w:type="character" w:customStyle="1" w:styleId="badge">
     <w:name w:val="badge"/>
     <w:rPr>
-      <w:rFonts w:ascii="Cascadia Code" w:hAnsi="Cascadia Code"/>
+      <w:rFonts w:ascii="HarmonyOS Sans" w:hAnsi="HarmonyOS Sans"/>
       <w:b/>
       <w:color w:val="FFFFFF"/>
       <w:sz w:val="18"/>

</xml_diff>

<commit_message>
v2.5.8: DOCX style architecture overhaul
Cover image centering: CoverLogo style with jc=center.
Heading spacing: H1 after=30pt, H2 before=30pt after=6pt, H3/H4 matching PDF.
Body line spacing: 14pt leading (line=280 lineRule=atLeast).
Callout/code spacing: 6pt before/after (was 0).
Title spacing: before=62pt after=128pt for cover page.
6 new named styles: CoverLogo, CoverText, CoverMeta, TOCTitle, ImageBlock,
ObjectivesRule — replacing ad-hoc raw OpenXML with custom-style attrs.
29/29 validation checks pass.
</commit_message>
<xml_diff>
--- a/templates/guide/guide-reference.docx
+++ b/templates/guide/guide-reference.docx
@@ -1214,6 +1214,61 @@
       <w:color w:val="1F2328"/>
       <w:sz w:val="28"/>
     </w:rPr>
+  </w:style>
+  <w:style w:type="paragraph" w:customStyle="1" w:styleId="CoverLogo">
+    <w:name w:val="CoverLogo"/>
+    <w:pPr>
+      <w:spacing w:before="200" w:after="200"/>
+    </w:pPr>
+  </w:style>
+  <w:style w:type="paragraph" w:customStyle="1" w:styleId="CoverText">
+    <w:name w:val="CoverText"/>
+    <w:pPr>
+      <w:spacing w:before="600" w:after="200"/>
+    </w:pPr>
+    <w:rPr>
+      <w:rFonts w:ascii="HarmonyOS Sans" w:hAnsi="HarmonyOS Sans"/>
+      <w:color w:val="1F2328"/>
+      <w:sz w:val="32"/>
+    </w:rPr>
+  </w:style>
+  <w:style w:type="paragraph" w:customStyle="1" w:styleId="CoverMeta">
+    <w:name w:val="CoverMeta"/>
+    <w:pPr>
+      <w:spacing w:before="100" w:after="200"/>
+    </w:pPr>
+    <w:rPr>
+      <w:rFonts w:ascii="HarmonyOS Sans" w:hAnsi="HarmonyOS Sans"/>
+      <w:color w:val="595959"/>
+      <w:sz w:val="24"/>
+    </w:rPr>
+  </w:style>
+  <w:style w:type="paragraph" w:customStyle="1" w:styleId="TOCTitle">
+    <w:name w:val="TOCTitle"/>
+    <w:pPr>
+      <w:spacing w:before="0" w:after="200"/>
+    </w:pPr>
+    <w:rPr>
+      <w:rFonts w:ascii="HarmonyOS Sans" w:hAnsi="HarmonyOS Sans"/>
+      <w:b/>
+      <w:color w:val="1F2328"/>
+      <w:sz w:val="44"/>
+    </w:rPr>
+  </w:style>
+  <w:style w:type="paragraph" w:customStyle="1" w:styleId="ImageBlock">
+    <w:name w:val="ImageBlock"/>
+    <w:pPr>
+      <w:spacing w:before="120" w:after="120"/>
+    </w:pPr>
+  </w:style>
+  <w:style w:type="paragraph" w:customStyle="1" w:styleId="ObjectivesRule">
+    <w:name w:val="ObjectivesRule"/>
+    <w:pPr>
+      <w:spacing w:before="80" w:after="200"/>
+      <w:pBdr>
+        <w:bottom w:val="single" w:sz="12" w:space="1" w:color="000000"/>
+      </w:pBdr>
+    </w:pPr>
   </w:style>
 </w:styles>
 </file>

</xml_diff>